<commit_message>
Nové metódy vo všetkých grafoch, súhrne, Exceli a dokumentoch
- hlavný beh 100 000 úloh teraz so všetkými šiestimi metódami
  (SZR, IM, VAM, JVR, MDD, PVM); výsledky SZR/IM/VAM sa nezmenili
- analyza.py pre ľubovoľné metódy: poradie 1.–6. miesta, párové testy
  aj pre nové metódy, JVR a MDD prerušovanou čiarou
- nové grafy, suhrn.md, hlavny100k.xlsx, sprava.docx a navod.docx
- tlačidlo Vyhodnotiť funguje aj pre výber všetkých metód
</commit_message>
<xml_diff>
--- a/sprava/navod.docx
+++ b/sprava/navod.docx
@@ -74,7 +74,7 @@
     <w:sdt>
       <w:sdtPr>
         <w:alias w:val="Obsah"/>
-        <w:id w:val="-2114810620"/>
+        <w:id w:val="-1076349863"/>
       </w:sdtPr>
       <w:sdtEndPr/>
       <w:sdtContent>
@@ -102,7 +102,7 @@
           <w:r>
             <w:fldChar w:fldCharType="separate"/>
           </w:r>
-          <w:hyperlink w:anchor="_Toc243981540" w:history="1">
+          <w:hyperlink w:anchor="_Toc243983864" w:history="1">
             <w:r>
               <w:rPr>
                 <w:rStyle w:val="Hypertextovprepojenie"/>
@@ -126,7 +126,7 @@
               <w:rPr>
                 <w:noProof/>
               </w:rPr>
-              <w:instrText xml:space="preserve"> PAGEREF _Toc243981540 \h </w:instrText>
+              <w:instrText xml:space="preserve"> PAGEREF _Toc243983864 \h </w:instrText>
             </w:r>
             <w:r>
               <w:rPr>
@@ -168,7 +168,7 @@
               <w14:ligatures w14:val="standardContextual"/>
             </w:rPr>
           </w:pPr>
-          <w:hyperlink w:anchor="_Toc243981541" w:history="1">
+          <w:hyperlink w:anchor="_Toc243983865" w:history="1">
             <w:r>
               <w:rPr>
                 <w:rStyle w:val="Hypertextovprepojenie"/>
@@ -192,7 +192,7 @@
               <w:rPr>
                 <w:noProof/>
               </w:rPr>
-              <w:instrText xml:space="preserve"> PAGEREF _Toc243981541 \h </w:instrText>
+              <w:instrText xml:space="preserve"> PAGEREF _Toc243983865 \h </w:instrText>
             </w:r>
             <w:r>
               <w:rPr>
@@ -234,7 +234,7 @@
               <w14:ligatures w14:val="standardContextual"/>
             </w:rPr>
           </w:pPr>
-          <w:hyperlink w:anchor="_Toc243981542" w:history="1">
+          <w:hyperlink w:anchor="_Toc243983866" w:history="1">
             <w:r>
               <w:rPr>
                 <w:rStyle w:val="Hypertextovprepojenie"/>
@@ -258,7 +258,7 @@
               <w:rPr>
                 <w:noProof/>
               </w:rPr>
-              <w:instrText xml:space="preserve"> PAGEREF _Toc243981542 \h </w:instrText>
+              <w:instrText xml:space="preserve"> PAGEREF _Toc243983866 \h </w:instrText>
             </w:r>
             <w:r>
               <w:rPr>
@@ -300,7 +300,7 @@
               <w14:ligatures w14:val="standardContextual"/>
             </w:rPr>
           </w:pPr>
-          <w:hyperlink w:anchor="_Toc243981543" w:history="1">
+          <w:hyperlink w:anchor="_Toc243983867" w:history="1">
             <w:r>
               <w:rPr>
                 <w:rStyle w:val="Hypertextovprepojenie"/>
@@ -324,7 +324,7 @@
               <w:rPr>
                 <w:noProof/>
               </w:rPr>
-              <w:instrText xml:space="preserve"> PAGEREF _Toc243981543 \h </w:instrText>
+              <w:instrText xml:space="preserve"> PAGEREF _Toc243983867 \h </w:instrText>
             </w:r>
             <w:r>
               <w:rPr>
@@ -366,7 +366,7 @@
               <w14:ligatures w14:val="standardContextual"/>
             </w:rPr>
           </w:pPr>
-          <w:hyperlink w:anchor="_Toc243981544" w:history="1">
+          <w:hyperlink w:anchor="_Toc243983868" w:history="1">
             <w:r>
               <w:rPr>
                 <w:rStyle w:val="Hypertextovprepojenie"/>
@@ -390,7 +390,7 @@
               <w:rPr>
                 <w:noProof/>
               </w:rPr>
-              <w:instrText xml:space="preserve"> PAGEREF _Toc243981544 \h </w:instrText>
+              <w:instrText xml:space="preserve"> PAGEREF _Toc243983868 \h </w:instrText>
             </w:r>
             <w:r>
               <w:rPr>
@@ -432,7 +432,7 @@
               <w14:ligatures w14:val="standardContextual"/>
             </w:rPr>
           </w:pPr>
-          <w:hyperlink w:anchor="_Toc243981545" w:history="1">
+          <w:hyperlink w:anchor="_Toc243983869" w:history="1">
             <w:r>
               <w:rPr>
                 <w:rStyle w:val="Hypertextovprepojenie"/>
@@ -456,7 +456,7 @@
               <w:rPr>
                 <w:noProof/>
               </w:rPr>
-              <w:instrText xml:space="preserve"> PAGEREF _Toc243981545 \h </w:instrText>
+              <w:instrText xml:space="preserve"> PAGEREF _Toc243983869 \h </w:instrText>
             </w:r>
             <w:r>
               <w:rPr>
@@ -498,7 +498,7 @@
               <w14:ligatures w14:val="standardContextual"/>
             </w:rPr>
           </w:pPr>
-          <w:hyperlink w:anchor="_Toc243981546" w:history="1">
+          <w:hyperlink w:anchor="_Toc243983870" w:history="1">
             <w:r>
               <w:rPr>
                 <w:rStyle w:val="Hypertextovprepojenie"/>
@@ -522,7 +522,7 @@
               <w:rPr>
                 <w:noProof/>
               </w:rPr>
-              <w:instrText xml:space="preserve"> PAGEREF _Toc243981546 \h </w:instrText>
+              <w:instrText xml:space="preserve"> PAGEREF _Toc243983870 \h </w:instrText>
             </w:r>
             <w:r>
               <w:rPr>
@@ -564,7 +564,7 @@
               <w14:ligatures w14:val="standardContextual"/>
             </w:rPr>
           </w:pPr>
-          <w:hyperlink w:anchor="_Toc243981547" w:history="1">
+          <w:hyperlink w:anchor="_Toc243983871" w:history="1">
             <w:r>
               <w:rPr>
                 <w:rStyle w:val="Hypertextovprepojenie"/>
@@ -588,7 +588,7 @@
               <w:rPr>
                 <w:noProof/>
               </w:rPr>
-              <w:instrText xml:space="preserve"> PAGEREF _Toc243981547 \h </w:instrText>
+              <w:instrText xml:space="preserve"> PAGEREF _Toc243983871 \h </w:instrText>
             </w:r>
             <w:r>
               <w:rPr>
@@ -630,7 +630,7 @@
               <w14:ligatures w14:val="standardContextual"/>
             </w:rPr>
           </w:pPr>
-          <w:hyperlink w:anchor="_Toc243981548" w:history="1">
+          <w:hyperlink w:anchor="_Toc243983872" w:history="1">
             <w:r>
               <w:rPr>
                 <w:rStyle w:val="Hypertextovprepojenie"/>
@@ -654,7 +654,7 @@
               <w:rPr>
                 <w:noProof/>
               </w:rPr>
-              <w:instrText xml:space="preserve"> PAGEREF _Toc243981548 \h </w:instrText>
+              <w:instrText xml:space="preserve"> PAGEREF _Toc243983872 \h </w:instrText>
             </w:r>
             <w:r>
               <w:rPr>
@@ -696,7 +696,7 @@
               <w14:ligatures w14:val="standardContextual"/>
             </w:rPr>
           </w:pPr>
-          <w:hyperlink w:anchor="_Toc243981549" w:history="1">
+          <w:hyperlink w:anchor="_Toc243983873" w:history="1">
             <w:r>
               <w:rPr>
                 <w:rStyle w:val="Hypertextovprepojenie"/>
@@ -720,7 +720,7 @@
               <w:rPr>
                 <w:noProof/>
               </w:rPr>
-              <w:instrText xml:space="preserve"> PAGEREF _Toc243981549 \h </w:instrText>
+              <w:instrText xml:space="preserve"> PAGEREF _Toc243983873 \h </w:instrText>
             </w:r>
             <w:r>
               <w:rPr>
@@ -762,7 +762,7 @@
               <w14:ligatures w14:val="standardContextual"/>
             </w:rPr>
           </w:pPr>
-          <w:hyperlink w:anchor="_Toc243981550" w:history="1">
+          <w:hyperlink w:anchor="_Toc243983874" w:history="1">
             <w:r>
               <w:rPr>
                 <w:rStyle w:val="Hypertextovprepojenie"/>
@@ -786,7 +786,7 @@
               <w:rPr>
                 <w:noProof/>
               </w:rPr>
-              <w:instrText xml:space="preserve"> PAGEREF _Toc243981550 \h </w:instrText>
+              <w:instrText xml:space="preserve"> PAGEREF _Toc243983874 \h </w:instrText>
             </w:r>
             <w:r>
               <w:rPr>
@@ -828,7 +828,7 @@
               <w14:ligatures w14:val="standardContextual"/>
             </w:rPr>
           </w:pPr>
-          <w:hyperlink w:anchor="_Toc243981551" w:history="1">
+          <w:hyperlink w:anchor="_Toc243983875" w:history="1">
             <w:r>
               <w:rPr>
                 <w:rStyle w:val="Hypertextovprepojenie"/>
@@ -852,7 +852,7 @@
               <w:rPr>
                 <w:noProof/>
               </w:rPr>
-              <w:instrText xml:space="preserve"> PAGEREF _Toc243981551 \h </w:instrText>
+              <w:instrText xml:space="preserve"> PAGEREF _Toc243983875 \h </w:instrText>
             </w:r>
             <w:r>
               <w:rPr>
@@ -894,7 +894,7 @@
               <w14:ligatures w14:val="standardContextual"/>
             </w:rPr>
           </w:pPr>
-          <w:hyperlink w:anchor="_Toc243981552" w:history="1">
+          <w:hyperlink w:anchor="_Toc243983876" w:history="1">
             <w:r>
               <w:rPr>
                 <w:rStyle w:val="Hypertextovprepojenie"/>
@@ -918,7 +918,7 @@
               <w:rPr>
                 <w:noProof/>
               </w:rPr>
-              <w:instrText xml:space="preserve"> PAGEREF _Toc243981552 \h </w:instrText>
+              <w:instrText xml:space="preserve"> PAGEREF _Toc243983876 \h </w:instrText>
             </w:r>
             <w:r>
               <w:rPr>
@@ -960,7 +960,7 @@
               <w14:ligatures w14:val="standardContextual"/>
             </w:rPr>
           </w:pPr>
-          <w:hyperlink w:anchor="_Toc243981553" w:history="1">
+          <w:hyperlink w:anchor="_Toc243983877" w:history="1">
             <w:r>
               <w:rPr>
                 <w:rStyle w:val="Hypertextovprepojenie"/>
@@ -984,7 +984,7 @@
               <w:rPr>
                 <w:noProof/>
               </w:rPr>
-              <w:instrText xml:space="preserve"> PAGEREF _Toc243981553 \h </w:instrText>
+              <w:instrText xml:space="preserve"> PAGEREF _Toc243983877 \h </w:instrText>
             </w:r>
             <w:r>
               <w:rPr>
@@ -1026,7 +1026,7 @@
               <w14:ligatures w14:val="standardContextual"/>
             </w:rPr>
           </w:pPr>
-          <w:hyperlink w:anchor="_Toc243981554" w:history="1">
+          <w:hyperlink w:anchor="_Toc243983878" w:history="1">
             <w:r>
               <w:rPr>
                 <w:rStyle w:val="Hypertextovprepojenie"/>
@@ -1050,7 +1050,7 @@
               <w:rPr>
                 <w:noProof/>
               </w:rPr>
-              <w:instrText xml:space="preserve"> PAGEREF _Toc243981554 \h </w:instrText>
+              <w:instrText xml:space="preserve"> PAGEREF _Toc243983878 \h </w:instrText>
             </w:r>
             <w:r>
               <w:rPr>
@@ -1067,7 +1067,7 @@
               <w:rPr>
                 <w:noProof/>
               </w:rPr>
-              <w:t>11</w:t>
+              <w:t>12</w:t>
             </w:r>
             <w:r>
               <w:rPr>
@@ -1092,7 +1092,7 @@
               <w14:ligatures w14:val="standardContextual"/>
             </w:rPr>
           </w:pPr>
-          <w:hyperlink w:anchor="_Toc243981555" w:history="1">
+          <w:hyperlink w:anchor="_Toc243983879" w:history="1">
             <w:r>
               <w:rPr>
                 <w:rStyle w:val="Hypertextovprepojenie"/>
@@ -1116,7 +1116,7 @@
               <w:rPr>
                 <w:noProof/>
               </w:rPr>
-              <w:instrText xml:space="preserve"> PAGEREF _Toc243981555 \h </w:instrText>
+              <w:instrText xml:space="preserve"> PAGEREF _Toc243983879 \h </w:instrText>
             </w:r>
             <w:r>
               <w:rPr>
@@ -1172,7 +1172,7 @@
       <w:pPr>
         <w:pStyle w:val="Nadpis1"/>
       </w:pPr>
-      <w:bookmarkStart w:id="0" w:name="_Toc243981540"/>
+      <w:bookmarkStart w:id="0" w:name="_Toc243983864"/>
       <w:r>
         <w:t>1. Čo program robí</w:t>
       </w:r>
@@ -1226,7 +1226,7 @@
       <w:pPr>
         <w:pStyle w:val="Nadpis1"/>
       </w:pPr>
-      <w:bookmarkStart w:id="1" w:name="_Toc243981541"/>
+      <w:bookmarkStart w:id="1" w:name="_Toc243983865"/>
       <w:r>
         <w:t>2. Dopravná úloha v skratke</w:t>
       </w:r>
@@ -2174,7 +2174,7 @@
       <w:pPr>
         <w:pStyle w:val="Nadpis1"/>
       </w:pPr>
-      <w:bookmarkStart w:id="2" w:name="_Toc243981542"/>
+      <w:bookmarkStart w:id="2" w:name="_Toc243983866"/>
       <w:r>
         <w:t>3. Skratky a pojmy</w:t>
       </w:r>
@@ -2184,7 +2184,7 @@
       <w:pPr>
         <w:pStyle w:val="Nadpis2"/>
       </w:pPr>
-      <w:bookmarkStart w:id="3" w:name="_Toc243981543"/>
+      <w:bookmarkStart w:id="3" w:name="_Toc243983867"/>
       <w:r>
         <w:t>3.1 Metódy</w:t>
       </w:r>
@@ -2904,7 +2904,7 @@
       <w:pPr>
         <w:pStyle w:val="Nadpis2"/>
       </w:pPr>
-      <w:bookmarkStart w:id="4" w:name="_Toc243981544"/>
+      <w:bookmarkStart w:id="4" w:name="_Toc243983868"/>
       <w:r>
         <w:t>3.2 Značky a pojmy</w:t>
       </w:r>
@@ -4417,7 +4417,7 @@
       <w:pPr>
         <w:pStyle w:val="Nadpis1"/>
       </w:pPr>
-      <w:bookmarkStart w:id="5" w:name="_Toc243981545"/>
+      <w:bookmarkStart w:id="5" w:name="_Toc243983869"/>
       <w:r>
         <w:t>4. Ako program funguje</w:t>
       </w:r>
@@ -4545,7 +4545,7 @@
       <w:pPr>
         <w:pStyle w:val="Nadpis1"/>
       </w:pPr>
-      <w:bookmarkStart w:id="6" w:name="_Toc243981546"/>
+      <w:bookmarkStart w:id="6" w:name="_Toc243983870"/>
       <w:r>
         <w:t>5. Metódy podrobnejšie</w:t>
       </w:r>
@@ -4674,7 +4674,7 @@
       <w:pPr>
         <w:pStyle w:val="Nadpis1"/>
       </w:pPr>
-      <w:bookmarkStart w:id="7" w:name="_Toc243981547"/>
+      <w:bookmarkStart w:id="7" w:name="_Toc243983871"/>
       <w:r>
         <w:t>6. Aplikácia</w:t>
       </w:r>
@@ -4700,7 +4700,7 @@
       <w:pPr>
         <w:pStyle w:val="Nadpis2"/>
       </w:pPr>
-      <w:bookmarkStart w:id="8" w:name="_Toc243981548"/>
+      <w:bookmarkStart w:id="8" w:name="_Toc243983872"/>
       <w:r>
         <w:t>6.1 Záložka Simulácia</w:t>
       </w:r>
@@ -4717,7 +4717,7 @@
           <w:noProof/>
         </w:rPr>
         <w:drawing>
-          <wp:inline distT="0" distB="0" distL="0" distR="0" wp14:anchorId="01008657" wp14:editId="0C2E74AD">
+          <wp:inline distT="0" distB="0" distL="0" distR="0" wp14:anchorId="24B675FE" wp14:editId="06D94AD2">
             <wp:extent cx="5905500" cy="3048000"/>
             <wp:effectExtent l="0" t="0" r="0" b="0"/>
             <wp:docPr id="1" name="okno_simulacia.png" descr="Obrázok 1: Záložka Simulácia po výpočte 1 000 úloh všetkými metódami" title="Obrázok 1: Záložka Simulácia po výpočte 1 000 úloh všetkými metódami"/>
@@ -4909,7 +4909,7 @@
         <w:t>Vyhodnotiť</w:t>
       </w:r>
       <w:r>
-        <w:t xml:space="preserve"> – podrobné štatistiky a 9 grafov (kapitola 7.2); len pre metódy z prednášky.</w:t>
+        <w:t xml:space="preserve"> – podrobné štatistiky a 9 grafov (kapitola 7.2); funguje, keď sú medzi metódami SZR, IM a VAM.</w:t>
       </w:r>
     </w:p>
     <w:p>
@@ -4941,7 +4941,7 @@
       <w:pPr>
         <w:pStyle w:val="Nadpis2"/>
       </w:pPr>
-      <w:bookmarkStart w:id="9" w:name="_Toc243981549"/>
+      <w:bookmarkStart w:id="9" w:name="_Toc243983873"/>
       <w:r>
         <w:t>6.2 Záložka Vlastná úloha</w:t>
       </w:r>
@@ -4958,7 +4958,7 @@
           <w:noProof/>
         </w:rPr>
         <w:drawing>
-          <wp:inline distT="0" distB="0" distL="0" distR="0" wp14:anchorId="6D3EC5BF" wp14:editId="1C351EDF">
+          <wp:inline distT="0" distB="0" distL="0" distR="0" wp14:anchorId="591820F2" wp14:editId="0DB4C8C5">
             <wp:extent cx="5905500" cy="3048000"/>
             <wp:effectExtent l="0" t="0" r="0" b="0"/>
             <wp:docPr id="2" name="okno_vlastna_uloha.png" descr="Obrázok 2: Vlastná úloha – príklad z prednášky riešený predvídavou metódou" title="Obrázok 2: Vlastná úloha – príklad z prednášky riešený predvídavou metódou"/>
@@ -5026,7 +5026,7 @@
       <w:pPr>
         <w:pStyle w:val="Nadpis2"/>
       </w:pPr>
-      <w:bookmarkStart w:id="10" w:name="_Toc243981550"/>
+      <w:bookmarkStart w:id="10" w:name="_Toc243983874"/>
       <w:r>
         <w:t>6.3 Záložka Ukážka náhodnej úlohy</w:t>
       </w:r>
@@ -5045,7 +5045,7 @@
       <w:pPr>
         <w:pStyle w:val="Nadpis1"/>
       </w:pPr>
-      <w:bookmarkStart w:id="11" w:name="_Toc243981551"/>
+      <w:bookmarkStart w:id="11" w:name="_Toc243983875"/>
       <w:r>
         <w:t>7. Grafy – ako fungujú a čo ukazujú</w:t>
       </w:r>
@@ -5057,7 +5057,7 @@
         <w:jc w:val="both"/>
       </w:pPr>
       <w:r>
-        <w:t>Všetky grafy používajú rovnaké farby: SZR modrá, IM oranžová, VAM zelená, JVR fialová, MDD tyrkysová, PVM žltá.</w:t>
+        <w:t>Všetky grafy používajú rovnaké farby: SZR modrá, IM oranžová, VAM zelená, JVR fialová, MDD tyrkysová, PVM žltá. JVR a MDD sú v grafoch z vyhodnotenia nakreslené prerušovanou čiarou – JVR leží presne na SZR a MDD takmer na VAM, takže by inak jedna čiara zakryla druhú.</w:t>
       </w:r>
     </w:p>
     <w:p>
@@ -5137,7 +5137,7 @@
       <w:pPr>
         <w:pStyle w:val="Nadpis2"/>
       </w:pPr>
-      <w:bookmarkStart w:id="12" w:name="_Toc243981552"/>
+      <w:bookmarkStart w:id="12" w:name="_Toc243983876"/>
       <w:r>
         <w:t>7.1 Živé grafy v aplikácii</w:t>
       </w:r>
@@ -5380,7 +5380,7 @@
       <w:pPr>
         <w:pStyle w:val="Nadpis2"/>
       </w:pPr>
-      <w:bookmarkStart w:id="13" w:name="_Toc243981553"/>
+      <w:bookmarkStart w:id="13" w:name="_Toc243983877"/>
       <w:r>
         <w:t>7.2 Grafy z vyhodnotenia (100 000 úloh)</w:t>
       </w:r>
@@ -5392,7 +5392,7 @@
         <w:jc w:val="both"/>
       </w:pPr>
       <w:r>
-        <w:t>Tieto grafy vytvorí tlačidlo Vyhodnotiť (alebo príkaz analyza.py) z uloženého behu. Ukázané sú výsledky hlavného behu so 100 000 úlohami pre metódy z prednášky. Uložené sú v priečinku grafy.</w:t>
+        <w:t>Tieto grafy vytvorí tlačidlo Vyhodnotiť (alebo príkaz analyza.py) z uloženého behu. Ukázané sú výsledky hlavného behu so 100 000 úlohami pre všetkých šesť metód – SZR, IM, VAM z prednášky a nové JVR, MDD, PVM. Uložené sú v priečinku grafy.</w:t>
       </w:r>
     </w:p>
     <w:p>
@@ -5414,7 +5414,7 @@
           <w:noProof/>
         </w:rPr>
         <w:drawing>
-          <wp:inline distT="0" distB="0" distL="0" distR="0" wp14:anchorId="3CEE113A" wp14:editId="1417AB19">
+          <wp:inline distT="0" distB="0" distL="0" distR="0" wp14:anchorId="6B86F3C6" wp14:editId="3342D456">
             <wp:extent cx="4476750" cy="2800350"/>
             <wp:effectExtent l="0" t="0" r="0" b="0"/>
             <wp:docPr id="3" name="odchylka_vs_velkost.png" descr="Obrázok 3: Priemerná odchýlka od optima podľa veľkosti úlohy m·n" title="Obrázok 3: Priemerná odchýlka od optima podľa veľkosti úlohy m·n"/>
@@ -5514,7 +5514,7 @@
         <w:t xml:space="preserve">Čo z neho vyplýva: </w:t>
       </w:r>
       <w:r>
-        <w:t>SZR sa s veľkosťou prudko zhoršuje (zo ~75 % až na ~430 %), IM a VAM rastú pomaly. VAM je pri každej veľkosti najlepšia.</w:t>
+        <w:t>SZR (a s ňou totožná JVR) sa s veľkosťou prudko zhoršuje (zo ~75 % až na ~430 %), ostatné metódy rastú pomaly. Z metód z prednášky je pri každej veľkosti najlepšia VAM, MDD je takmer na nej a PVM je pri každej veľkosti ešte lepšia – má približne polovičnú odchýlku ako VAM.</w:t>
       </w:r>
     </w:p>
     <w:p>
@@ -5536,7 +5536,7 @@
           <w:noProof/>
         </w:rPr>
         <w:drawing>
-          <wp:inline distT="0" distB="0" distL="0" distR="0" wp14:anchorId="6B0BAD6E" wp14:editId="3A093C83">
+          <wp:inline distT="0" distB="0" distL="0" distR="0" wp14:anchorId="25D8C62E" wp14:editId="08378B83">
             <wp:extent cx="4476750" cy="2800350"/>
             <wp:effectExtent l="0" t="0" r="0" b="0"/>
             <wp:docPr id="4" name="kroky_modi_vs_velkost.png" descr="Obrázok 4: Priemerný počet krokov MODI do optima" title="Obrázok 4: Priemerný počet krokov MODI do optima"/>
@@ -5636,7 +5636,7 @@
         <w:t xml:space="preserve">Čo z neho vyplýva: </w:t>
       </w:r>
       <w:r>
-        <w:t>po SZR treba pri najväčších úlohách okolo 60 krokov, po IM okolo 22 a po VAM okolo 15. Lepšie východiskové riešenie = menej práce.</w:t>
+        <w:t>po SZR a JVR treba pri najväčších úlohách okolo 64 krokov, po IM okolo 22, po VAM a MDD okolo 15 a po PVM okolo 13. Lepšie východiskové riešenie = menej práce.</w:t>
       </w:r>
     </w:p>
     <w:p>
@@ -5658,7 +5658,7 @@
           <w:noProof/>
         </w:rPr>
         <w:drawing>
-          <wp:inline distT="0" distB="0" distL="0" distR="0" wp14:anchorId="0F6348A2" wp14:editId="6EE61690">
+          <wp:inline distT="0" distB="0" distL="0" distR="0" wp14:anchorId="55EFC7ED" wp14:editId="6AD5B6CC">
             <wp:extent cx="4476750" cy="2800350"/>
             <wp:effectExtent l="0" t="0" r="0" b="0"/>
             <wp:docPr id="5" name="optimum_vs_velkost.png" descr="Obrázok 5: Podiel úloh s trafeným optimom podľa veľkosti" title="Obrázok 5: Podiel úloh s trafeným optimom podľa veľkosti"/>
@@ -5758,7 +5758,7 @@
         <w:t xml:space="preserve">Čo z neho vyplýva: </w:t>
       </w:r>
       <w:r>
-        <w:t>pri malých úlohách VAM trafí optimum hneď až v 40 % prípadov, IM v 11 %. Pri úlohách nad ~150 polí to už nezvládne žiadna metóda – vždy treba MODI.</w:t>
+        <w:t>pri najmenších úlohách trafí PVM optimum hneď až v 65 % prípadov, VAM v 40 %, MDD v 34 % a IM v 11 %. Pri úlohách nad ~150 polí to už takmer nezvládne žiadna metóda – vždy treba MODI.</w:t>
       </w:r>
     </w:p>
     <w:p>
@@ -5780,7 +5780,7 @@
           <w:noProof/>
         </w:rPr>
         <w:drawing>
-          <wp:inline distT="0" distB="0" distL="0" distR="0" wp14:anchorId="0BFC767F" wp14:editId="6F5A9411">
+          <wp:inline distT="0" distB="0" distL="0" distR="0" wp14:anchorId="23D298F0" wp14:editId="6141E728">
             <wp:extent cx="4476750" cy="2800350"/>
             <wp:effectExtent l="0" t="0" r="0" b="0"/>
             <wp:docPr id="6" name="cas_celkovy_vs_velkost.png" descr="Obrázok 6: Celkový čas (metóda + MODI) podľa veľkosti úlohy" title="Obrázok 6: Celkový čas (metóda + MODI) podľa veľkosti úlohy"/>
@@ -5880,7 +5880,7 @@
         <w:t xml:space="preserve">Čo z neho vyplýva: </w:t>
       </w:r>
       <w:r>
-        <w:t>SZR je celkovo najpomalšia, lebo MODI má po nej veľa práce. IM a VAM sú takmer rovnako rýchle – IM je mierne rýchlejšia pri malých úlohách, pri veľkých sa vyrovnajú. Časy závisia od počítača.</w:t>
+        <w:t>IM, VAM a MDD sú takmer rovnako rýchle – IM je mierne rýchlejšia pri malých úlohách, pri veľkých sa vyrovnajú. SZR a JVR sú pomalšie, lebo MODI má po nich veľa práce. Najpomalšia je PVM (desiatky až stovky ms), lebo v každom kroku skúša troch kandidátov a dopočítava úlohu metódou VAM. Časy závisia od počítača.</w:t>
       </w:r>
     </w:p>
     <w:p>
@@ -5902,7 +5902,7 @@
           <w:noProof/>
         </w:rPr>
         <w:drawing>
-          <wp:inline distT="0" distB="0" distL="0" distR="0" wp14:anchorId="00EF3748" wp14:editId="7428763B">
+          <wp:inline distT="0" distB="0" distL="0" distR="0" wp14:anchorId="384DDDAC" wp14:editId="1E3DD7CB">
             <wp:extent cx="4476750" cy="2800350"/>
             <wp:effectExtent l="0" t="0" r="0" b="0"/>
             <wp:docPr id="7" name="cas_metody_vs_velkost.png" descr="Obrázok 7: Čas samotnej východiskovej metódy (bez MODI)" title="Obrázok 7: Čas samotnej východiskovej metódy (bez MODI)"/>
@@ -6002,7 +6002,7 @@
         <w:t xml:space="preserve">Čo z neho vyplýva: </w:t>
       </w:r>
       <w:r>
-        <w:t>SZR je najrýchlejšia, VAM najpomalšia (počíta diferencie v každom kroku). VAM si však tento čas vráti tým, že MODI má po nej najmenej práce.</w:t>
+        <w:t>SZR a JVR sú najrýchlejšie, VAM a MDD počítajú dlhšie (diferencie v každom kroku), PVM je asi 35-krát pomalšia ako VAM. VAM si svoj čas vráti tým, že MODI má po nej málo práce; PVM je presnejšia, ale za cenu oveľa dlhšieho výpočtu.</w:t>
       </w:r>
     </w:p>
     <w:p>
@@ -6024,8 +6024,8 @@
           <w:noProof/>
         </w:rPr>
         <w:drawing>
-          <wp:inline distT="0" distB="0" distL="0" distR="0" wp14:anchorId="4F4CB4AA" wp14:editId="4CBBAD1B">
-            <wp:extent cx="4476750" cy="2238375"/>
+          <wp:inline distT="0" distB="0" distL="0" distR="0" wp14:anchorId="458C4516" wp14:editId="31433BA1">
+            <wp:extent cx="4476750" cy="1866900"/>
             <wp:effectExtent l="0" t="0" r="0" b="0"/>
             <wp:docPr id="8" name="boxplot_odchylok.png" descr="Obrázok 8: Rozdelenie odchýlok – krabicové grafy" title="Obrázok 8: Rozdelenie odchýlok – krabicové grafy"/>
             <wp:cNvGraphicFramePr>
@@ -6050,7 +6050,7 @@
                   <pic:spPr bwMode="auto">
                     <a:xfrm>
                       <a:off x="0" y="0"/>
-                      <a:ext cx="4476750" cy="2238375"/>
+                      <a:ext cx="4476750" cy="1866900"/>
                     </a:xfrm>
                     <a:prstGeom prst="rect">
                       <a:avLst/>
@@ -6108,7 +6108,7 @@
         <w:t xml:space="preserve">Ako ho čítať: </w:t>
       </w:r>
       <w:r>
-        <w:t>krabica siaha od 1. po 3. kvartil (v nej je prostredná polovica úloh), čiara v krabici je medián, „fúzy“ ukazujú rozsah bežných hodnôt. Vpravo je detail IM a VAM, lebo vedľa SZR by boli príliš malé.</w:t>
+        <w:t>krabica siaha od 1. po 3. kvartil (v nej je prostredná polovica úloh), čiara v krabici je medián, „fúzy“ ukazujú rozsah bežných hodnôt. Vpravo je detail metód, ktoré hľadia na ceny (IM, VAM, MDD, PVM), lebo vedľa SZR a JVR by boli príliš malé.</w:t>
       </w:r>
     </w:p>
     <w:p>
@@ -6124,7 +6124,7 @@
         <w:t xml:space="preserve">Čo z neho vyplýva: </w:t>
       </w:r>
       <w:r>
-        <w:t>VAM má krabicu najnižšie a najužšiu – je nielen najlepšia v priemere, ale aj najspoľahlivejšia.</w:t>
+        <w:t>PVM má krabicu najnižšie a najužšiu, VAM a MDD sú takmer rovnaké. Z metód z prednášky je VAM nielen najlepšia v priemere, ale aj najspoľahlivejšia.</w:t>
       </w:r>
     </w:p>
     <w:p>
@@ -6146,7 +6146,7 @@
           <w:noProof/>
         </w:rPr>
         <w:drawing>
-          <wp:inline distT="0" distB="0" distL="0" distR="0" wp14:anchorId="56ECCC5C" wp14:editId="5568C04F">
+          <wp:inline distT="0" distB="0" distL="0" distR="0" wp14:anchorId="7B5352C5" wp14:editId="469B541D">
             <wp:extent cx="4476750" cy="2800350"/>
             <wp:effectExtent l="0" t="0" r="0" b="0"/>
             <wp:docPr id="9" name="ecdf_odchylky.png" descr="Obrázok 9: Empirická distribučná funkcia odchýlky od optima" title="Obrázok 9: Empirická distribučná funkcia odchýlky od optima"/>
@@ -6246,7 +6246,7 @@
         <w:t xml:space="preserve">Čo z neho vyplýva: </w:t>
       </w:r>
       <w:r>
-        <w:t>napríklad pri 10 % odchýlke: VAM má takú malú odchýlku asi v polovici úloh, IM len asi v 13 % a SZR takmer nikdy.</w:t>
+        <w:t>napríklad pri 10 % odchýlke: PVM má takú malú odchýlku asi v 70 % úloh, VAM a MDD asi v polovici, IM len asi v 13 % a SZR s JVR takmer nikdy.</w:t>
       </w:r>
     </w:p>
     <w:p>
@@ -6268,8 +6268,8 @@
           <w:noProof/>
         </w:rPr>
         <w:drawing>
-          <wp:inline distT="0" distB="0" distL="0" distR="0" wp14:anchorId="2EA67D34" wp14:editId="441DF9F3">
-            <wp:extent cx="4476750" cy="2514600"/>
+          <wp:inline distT="0" distB="0" distL="0" distR="0" wp14:anchorId="4FF6C2D0" wp14:editId="489C7D14">
+            <wp:extent cx="4476750" cy="3876675"/>
             <wp:effectExtent l="0" t="0" r="0" b="0"/>
             <wp:docPr id="10" name="poradie_metod.png" descr="Obrázok 10: Ako často bola metóda 1., 2. alebo 3. v tej istej úlohe" title="Obrázok 10: Ako často bola metóda 1., 2. alebo 3. v tej istej úlohe"/>
             <wp:cNvGraphicFramePr>
@@ -6294,7 +6294,7 @@
                   <pic:spPr bwMode="auto">
                     <a:xfrm>
                       <a:off x="0" y="0"/>
-                      <a:ext cx="4476750" cy="2514600"/>
+                      <a:ext cx="4476750" cy="3876675"/>
                     </a:xfrm>
                     <a:prstGeom prst="rect">
                       <a:avLst/>
@@ -6352,7 +6352,7 @@
         <w:t xml:space="preserve">Ako ho čítať: </w:t>
       </w:r>
       <w:r>
-        <w:t>každý pruh má 100 %, sýta farba je 1. miesto, svetlejšie 2. a 3. miesto. Pri remíze majú metódy spoločné miesto.</w:t>
+        <w:t>každý pruh má 100 %, sýta farba je 1. miesto, čím svetlejšia, tým horšie miesto. Pri remíze majú metódy spoločné miesto – preto sú SZR a JVR vždy spolu na poslednom (5.) mieste.</w:t>
       </w:r>
     </w:p>
     <w:p>
@@ -6368,7 +6368,7 @@
         <w:t xml:space="preserve">Čo z neho vyplýva: </w:t>
       </w:r>
       <w:r>
-        <w:t>VAM je najlepšia v 88,8 % úloh, IM v 12,4 %, SZR je takmer vždy posledná (99,4 %).</w:t>
+        <w:t>PVM je najlepšia v 94,5 % úloh. VAM a MDD sa delia o 2. a 3. miesto (VAM je prvá v 16,8 %, MDD v 15,1 % úloh), IM je väčšinou 4. a SZR s JVR sú takmer vždy posledné (99,4 %). Medzi metódami z prednášky by bola VAM najlepšia v 88,8 % úloh.</w:t>
       </w:r>
     </w:p>
     <w:p>
@@ -6390,8 +6390,8 @@
           <w:noProof/>
         </w:rPr>
         <w:drawing>
-          <wp:inline distT="0" distB="0" distL="0" distR="0" wp14:anchorId="4D0AB2BF" wp14:editId="2E783090">
-            <wp:extent cx="4476750" cy="2238375"/>
+          <wp:inline distT="0" distB="0" distL="0" distR="0" wp14:anchorId="3677481A" wp14:editId="1915CD23">
+            <wp:extent cx="4476750" cy="1866900"/>
             <wp:effectExtent l="0" t="0" r="0" b="0"/>
             <wp:docPr id="11" name="odchylka_typ_cena.png" descr="Obrázok 11: Odchýlka od optima podľa typu úlohy a rozsahu cien" title="Obrázok 11: Odchýlka od optima podľa typu úlohy a rozsahu cien"/>
             <wp:cNvGraphicFramePr>
@@ -6416,7 +6416,7 @@
                   <pic:spPr bwMode="auto">
                     <a:xfrm>
                       <a:off x="0" y="0"/>
-                      <a:ext cx="4476750" cy="2238375"/>
+                      <a:ext cx="4476750" cy="1866900"/>
                     </a:xfrm>
                     <a:prstGeom prst="rect">
                       <a:avLst/>
@@ -6490,14 +6490,14 @@
         <w:t xml:space="preserve">Čo z neho vyplýva: </w:t>
       </w:r>
       <w:r>
-        <w:t>nevyrovnané úlohy (prebytok ponuky alebo dopytu) sú pre všetky metódy ťažšie a pri cenách 1–100 sú odchýlky mierne väčšie ako pri 1–20. Poradie VAM &lt; IM &lt; SZR platí vo všetkých skupinách.</w:t>
+        <w:t>nevyrovnané úlohy (prebytok ponuky alebo dopytu) sú pre všetky metódy ťažšie a pri cenách 1–100 sú odchýlky mierne väčšie ako pri 1–20. Poradie PVM &lt; VAM ≈ MDD &lt; IM &lt; SZR = JVR platí vo všetkých skupinách.</w:t>
       </w:r>
     </w:p>
     <w:p>
       <w:pPr>
         <w:pStyle w:val="Nadpis2"/>
       </w:pPr>
-      <w:bookmarkStart w:id="14" w:name="_Toc243981554"/>
+      <w:bookmarkStart w:id="14" w:name="_Toc243983878"/>
       <w:r>
         <w:t>7.3 Grafy v Exceli</w:t>
       </w:r>
@@ -6585,7 +6585,7 @@
       <w:pPr>
         <w:pStyle w:val="Nadpis1"/>
       </w:pPr>
-      <w:bookmarkStart w:id="15" w:name="_Toc243981555"/>
+      <w:bookmarkStart w:id="15" w:name="_Toc243983879"/>
       <w:r>
         <w:t>8. Hlavné výsledky</w:t>
       </w:r>
@@ -6597,7 +6597,7 @@
         <w:jc w:val="both"/>
       </w:pPr>
       <w:r>
-        <w:t>Porovnanie všetkých šiestich metód na rovnakých 20 000 náhodných úlohách (seed 20261025):</w:t>
+        <w:t>Porovnanie všetkých šiestich metód na rovnakých 100 000 náhodných úlohách (hlavný beh, seed 20261025):</w:t>
       </w:r>
     </w:p>
     <w:tbl>
@@ -6833,7 +6833,7 @@
                 <w:sz w:val="19"/>
                 <w:szCs w:val="19"/>
               </w:rPr>
-              <w:t>216,8 %</w:t>
+              <w:t>216,9 %</w:t>
             </w:r>
           </w:p>
         </w:tc>
@@ -6862,7 +6862,7 @@
                 <w:sz w:val="19"/>
                 <w:szCs w:val="19"/>
               </w:rPr>
-              <w:t>26,4</w:t>
+              <w:t>26,6</w:t>
             </w:r>
           </w:p>
         </w:tc>
@@ -6919,7 +6919,7 @@
                 <w:sz w:val="19"/>
                 <w:szCs w:val="19"/>
               </w:rPr>
-              <w:t>0,92 %</w:t>
+              <w:t>0,88 %</w:t>
             </w:r>
           </w:p>
         </w:tc>
@@ -7034,7 +7034,7 @@
                 <w:sz w:val="19"/>
                 <w:szCs w:val="19"/>
               </w:rPr>
-              <w:t>5,91 %</w:t>
+              <w:t>6,00 %</w:t>
             </w:r>
           </w:p>
         </w:tc>
@@ -7063,7 +7063,7 @@
                 <w:sz w:val="19"/>
                 <w:szCs w:val="19"/>
               </w:rPr>
-              <w:t>15,2 %</w:t>
+              <w:t>15,3 %</w:t>
             </w:r>
           </w:p>
         </w:tc>
@@ -7092,7 +7092,7 @@
                 <w:sz w:val="19"/>
                 <w:szCs w:val="19"/>
               </w:rPr>
-              <w:t>6,3</w:t>
+              <w:t>6,4</w:t>
             </w:r>
           </w:p>
         </w:tc>
@@ -7178,7 +7178,7 @@
                 <w:sz w:val="19"/>
                 <w:szCs w:val="19"/>
               </w:rPr>
-              <w:t>216,8 %</w:t>
+              <w:t>216,9 %</w:t>
             </w:r>
           </w:p>
         </w:tc>
@@ -7207,7 +7207,7 @@
                 <w:sz w:val="19"/>
                 <w:szCs w:val="19"/>
               </w:rPr>
-              <w:t>26,4</w:t>
+              <w:t>26,6</w:t>
             </w:r>
           </w:p>
         </w:tc>
@@ -7264,7 +7264,7 @@
                 <w:sz w:val="19"/>
                 <w:szCs w:val="19"/>
               </w:rPr>
-              <w:t>4,71 %</w:t>
+              <w:t>4,78 %</w:t>
             </w:r>
           </w:p>
         </w:tc>
@@ -7379,7 +7379,7 @@
                 <w:sz w:val="19"/>
                 <w:szCs w:val="19"/>
               </w:rPr>
-              <w:t>12,34 %</w:t>
+              <w:t>12,31 %</w:t>
             </w:r>
           </w:p>
         </w:tc>
@@ -7456,7 +7456,7 @@
           <w:sz w:val="18"/>
           <w:szCs w:val="18"/>
         </w:rPr>
-        <w:t>Tabuľka 4: Porovnanie metód (20 000 úloh)</w:t>
+        <w:t>Tabuľka 4: Porovnanie metód (100 000 úloh)</w:t>
       </w:r>
     </w:p>
     <w:p>
@@ -7655,10 +7655,96 @@
 <file path=word/numbering.xml><?xml version="1.0" encoding="utf-8"?>
 <w:numbering xmlns:wpc="http://schemas.microsoft.com/office/word/2010/wordprocessingCanvas" xmlns:cx="http://schemas.microsoft.com/office/drawing/2014/chartex" xmlns:cx1="http://schemas.microsoft.com/office/drawing/2015/9/8/chartex" xmlns:cx2="http://schemas.microsoft.com/office/drawing/2015/10/21/chartex" xmlns:cx3="http://schemas.microsoft.com/office/drawing/2016/5/9/chartex" xmlns:cx4="http://schemas.microsoft.com/office/drawing/2016/5/10/chartex" xmlns:cx5="http://schemas.microsoft.com/office/drawing/2016/5/11/chartex" xmlns:cx6="http://schemas.microsoft.com/office/drawing/2016/5/12/chartex" xmlns:cx7="http://schemas.microsoft.com/office/drawing/2016/5/13/chartex" xmlns:cx8="http://schemas.microsoft.com/office/drawing/2016/5/14/chartex" xmlns:mc="http://schemas.openxmlformats.org/markup-compatibility/2006" xmlns:aink="http://schemas.microsoft.com/office/drawing/2016/ink" xmlns:am3d="http://schemas.microsoft.com/office/drawing/2017/model3d" xmlns:o="urn:schemas-microsoft-com:office:office" xmlns:oel="http://schemas.microsoft.com/office/2019/extlst" xmlns:r="http://schemas.openxmlformats.org/officeDocument/2006/relationships" xmlns:m="http://schemas.openxmlformats.org/officeDocument/2006/math" xmlns:v="urn:schemas-microsoft-com:vml" xmlns:wp14="http://schemas.microsoft.com/office/word/2010/wordprocessingDrawing" xmlns:wp="http://schemas.openxmlformats.org/drawingml/2006/wordprocessingDrawing" xmlns:w10="urn:schemas-microsoft-com:office:word" xmlns:w="http://schemas.openxmlformats.org/wordprocessingml/2006/main" xmlns:w14="http://schemas.microsoft.com/office/word/2010/wordml" xmlns:w15="http://schemas.microsoft.com/office/word/2012/wordml" xmlns:w16cex="http://schemas.microsoft.com/office/word/2018/wordml/cex" xmlns:w16cid="http://schemas.microsoft.com/office/word/2016/wordml/cid" xmlns:w16="http://schemas.microsoft.com/office/word/2018/wordml" xmlns:w16du="http://schemas.microsoft.com/office/word/2023/wordml/word16du" xmlns:w16sdtdh="http://schemas.microsoft.com/office/word/2020/wordml/sdtdatahash" xmlns:w16sdtfl="http://schemas.microsoft.com/office/word/2024/wordml/sdtformatlock" xmlns:w16se="http://schemas.microsoft.com/office/word/2015/wordml/symex" xmlns:wpg="http://schemas.microsoft.com/office/word/2010/wordprocessingGroup" xmlns:wpi="http://schemas.microsoft.com/office/word/2010/wordprocessingInk" xmlns:wne="http://schemas.microsoft.com/office/word/2006/wordml" xmlns:wps="http://schemas.microsoft.com/office/word/2010/wordprocessingShape" mc:Ignorable="w14 w15 w16se w16cid w16 w16cex w16sdtdh w16sdtfl w16du wp14">
   <w:abstractNum w:abstractNumId="0" w15:restartNumberingAfterBreak="0">
-    <w:nsid w:val="02ED6634"/>
+    <w:nsid w:val="0A7A0A57"/>
     <w:multiLevelType w:val="hybridMultilevel"/>
-    <w:tmpl w:val="58482CA8"/>
-    <w:lvl w:ilvl="0" w:tplc="8F6833F8">
+    <w:tmpl w:val="636EDFD4"/>
+    <w:lvl w:ilvl="0" w:tplc="866E9EE8" w:tentative="1">
+      <w:start w:val="1"/>
+      <w:numFmt w:val="bullet"/>
+      <w:lvlText w:val="●"/>
+      <w:lvlJc w:val="left"/>
+      <w:pPr>
+        <w:ind w:left="720" w:hanging="360"/>
+      </w:pPr>
+    </w:lvl>
+    <w:lvl w:ilvl="1" w:tplc="B93E389E" w:tentative="1">
+      <w:start w:val="1"/>
+      <w:numFmt w:val="bullet"/>
+      <w:lvlText w:val="○"/>
+      <w:lvlJc w:val="left"/>
+      <w:pPr>
+        <w:ind w:left="1440" w:hanging="360"/>
+      </w:pPr>
+    </w:lvl>
+    <w:lvl w:ilvl="2" w:tplc="7A6E5EDE" w:tentative="1">
+      <w:start w:val="1"/>
+      <w:numFmt w:val="bullet"/>
+      <w:lvlText w:val="■"/>
+      <w:lvlJc w:val="left"/>
+      <w:pPr>
+        <w:ind w:left="2160" w:hanging="360"/>
+      </w:pPr>
+    </w:lvl>
+    <w:lvl w:ilvl="3" w:tplc="F184DBC8" w:tentative="1">
+      <w:start w:val="1"/>
+      <w:numFmt w:val="bullet"/>
+      <w:lvlText w:val="●"/>
+      <w:lvlJc w:val="left"/>
+      <w:pPr>
+        <w:ind w:left="2880" w:hanging="360"/>
+      </w:pPr>
+    </w:lvl>
+    <w:lvl w:ilvl="4" w:tplc="3724B6A0" w:tentative="1">
+      <w:start w:val="1"/>
+      <w:numFmt w:val="bullet"/>
+      <w:lvlText w:val="○"/>
+      <w:lvlJc w:val="left"/>
+      <w:pPr>
+        <w:ind w:left="3600" w:hanging="360"/>
+      </w:pPr>
+    </w:lvl>
+    <w:lvl w:ilvl="5" w:tplc="8EF85D98" w:tentative="1">
+      <w:start w:val="1"/>
+      <w:numFmt w:val="bullet"/>
+      <w:lvlText w:val="■"/>
+      <w:lvlJc w:val="left"/>
+      <w:pPr>
+        <w:ind w:left="4320" w:hanging="360"/>
+      </w:pPr>
+    </w:lvl>
+    <w:lvl w:ilvl="6" w:tplc="06A8C080" w:tentative="1">
+      <w:start w:val="1"/>
+      <w:numFmt w:val="bullet"/>
+      <w:lvlText w:val="●"/>
+      <w:lvlJc w:val="left"/>
+      <w:pPr>
+        <w:ind w:left="5040" w:hanging="360"/>
+      </w:pPr>
+    </w:lvl>
+    <w:lvl w:ilvl="7" w:tplc="9F68D334" w:tentative="1">
+      <w:start w:val="1"/>
+      <w:numFmt w:val="bullet"/>
+      <w:lvlText w:val="●"/>
+      <w:lvlJc w:val="left"/>
+      <w:pPr>
+        <w:ind w:left="5760" w:hanging="360"/>
+      </w:pPr>
+    </w:lvl>
+    <w:lvl w:ilvl="8" w:tplc="244C030E" w:tentative="1">
+      <w:start w:val="1"/>
+      <w:numFmt w:val="bullet"/>
+      <w:lvlText w:val="●"/>
+      <w:lvlJc w:val="left"/>
+      <w:pPr>
+        <w:ind w:left="6480" w:hanging="360"/>
+      </w:pPr>
+    </w:lvl>
+  </w:abstractNum>
+  <w:abstractNum w:abstractNumId="1" w15:restartNumberingAfterBreak="0">
+    <w:nsid w:val="4B343F24"/>
+    <w:multiLevelType w:val="hybridMultilevel"/>
+    <w:tmpl w:val="2550F876"/>
+    <w:lvl w:ilvl="0" w:tplc="7274570C">
       <w:start w:val="1"/>
       <w:numFmt w:val="decimal"/>
       <w:lvlText w:val="%1."/>
@@ -7667,201 +7753,115 @@
         <w:ind w:left="567" w:hanging="340"/>
       </w:pPr>
     </w:lvl>
-    <w:lvl w:ilvl="1" w:tplc="2E7475FC">
+    <w:lvl w:ilvl="1" w:tplc="E566283E">
       <w:numFmt w:val="decimal"/>
       <w:lvlText w:val=""/>
       <w:lvlJc w:val="left"/>
     </w:lvl>
-    <w:lvl w:ilvl="2" w:tplc="A41C5F62">
+    <w:lvl w:ilvl="2" w:tplc="47A62816">
       <w:numFmt w:val="decimal"/>
       <w:lvlText w:val=""/>
       <w:lvlJc w:val="left"/>
     </w:lvl>
-    <w:lvl w:ilvl="3" w:tplc="ADD44D6C">
+    <w:lvl w:ilvl="3" w:tplc="50902CBA">
       <w:numFmt w:val="decimal"/>
       <w:lvlText w:val=""/>
       <w:lvlJc w:val="left"/>
     </w:lvl>
-    <w:lvl w:ilvl="4" w:tplc="7D36E7BC">
+    <w:lvl w:ilvl="4" w:tplc="3A983430">
       <w:numFmt w:val="decimal"/>
       <w:lvlText w:val=""/>
       <w:lvlJc w:val="left"/>
     </w:lvl>
-    <w:lvl w:ilvl="5" w:tplc="AD6A6926">
+    <w:lvl w:ilvl="5" w:tplc="99C83746">
       <w:numFmt w:val="decimal"/>
       <w:lvlText w:val=""/>
       <w:lvlJc w:val="left"/>
     </w:lvl>
-    <w:lvl w:ilvl="6" w:tplc="5EC0608E">
+    <w:lvl w:ilvl="6" w:tplc="F530F50C">
       <w:numFmt w:val="decimal"/>
       <w:lvlText w:val=""/>
       <w:lvlJc w:val="left"/>
     </w:lvl>
-    <w:lvl w:ilvl="7" w:tplc="9B160270">
+    <w:lvl w:ilvl="7" w:tplc="540A7EC6">
       <w:numFmt w:val="decimal"/>
       <w:lvlText w:val=""/>
       <w:lvlJc w:val="left"/>
     </w:lvl>
-    <w:lvl w:ilvl="8" w:tplc="F4AAE40A">
-      <w:numFmt w:val="decimal"/>
-      <w:lvlText w:val=""/>
-      <w:lvlJc w:val="left"/>
-    </w:lvl>
-  </w:abstractNum>
-  <w:abstractNum w:abstractNumId="1" w15:restartNumberingAfterBreak="0">
-    <w:nsid w:val="137D4E4F"/>
-    <w:multiLevelType w:val="hybridMultilevel"/>
-    <w:tmpl w:val="CDFA683E"/>
-    <w:lvl w:ilvl="0" w:tplc="AF2477A0">
-      <w:start w:val="1"/>
-      <w:numFmt w:val="bullet"/>
-      <w:lvlText w:val="•"/>
-      <w:lvlJc w:val="left"/>
-      <w:pPr>
-        <w:ind w:left="567" w:hanging="283"/>
-      </w:pPr>
-    </w:lvl>
-    <w:lvl w:ilvl="1" w:tplc="C74AD806">
-      <w:numFmt w:val="decimal"/>
-      <w:lvlText w:val=""/>
-      <w:lvlJc w:val="left"/>
-    </w:lvl>
-    <w:lvl w:ilvl="2" w:tplc="0AB03EFE">
-      <w:numFmt w:val="decimal"/>
-      <w:lvlText w:val=""/>
-      <w:lvlJc w:val="left"/>
-    </w:lvl>
-    <w:lvl w:ilvl="3" w:tplc="F4643C36">
-      <w:numFmt w:val="decimal"/>
-      <w:lvlText w:val=""/>
-      <w:lvlJc w:val="left"/>
-    </w:lvl>
-    <w:lvl w:ilvl="4" w:tplc="71F415D0">
-      <w:numFmt w:val="decimal"/>
-      <w:lvlText w:val=""/>
-      <w:lvlJc w:val="left"/>
-    </w:lvl>
-    <w:lvl w:ilvl="5" w:tplc="3B140272">
-      <w:numFmt w:val="decimal"/>
-      <w:lvlText w:val=""/>
-      <w:lvlJc w:val="left"/>
-    </w:lvl>
-    <w:lvl w:ilvl="6" w:tplc="45846466">
-      <w:numFmt w:val="decimal"/>
-      <w:lvlText w:val=""/>
-      <w:lvlJc w:val="left"/>
-    </w:lvl>
-    <w:lvl w:ilvl="7" w:tplc="138C4308">
-      <w:numFmt w:val="decimal"/>
-      <w:lvlText w:val=""/>
-      <w:lvlJc w:val="left"/>
-    </w:lvl>
-    <w:lvl w:ilvl="8" w:tplc="EA6E0EE2">
+    <w:lvl w:ilvl="8" w:tplc="FFD07914">
       <w:numFmt w:val="decimal"/>
       <w:lvlText w:val=""/>
       <w:lvlJc w:val="left"/>
     </w:lvl>
   </w:abstractNum>
   <w:abstractNum w:abstractNumId="2" w15:restartNumberingAfterBreak="0">
-    <w:nsid w:val="35391104"/>
+    <w:nsid w:val="5CFC7C64"/>
     <w:multiLevelType w:val="hybridMultilevel"/>
-    <w:tmpl w:val="60227A96"/>
-    <w:lvl w:ilvl="0" w:tplc="69C2CAFE" w:tentative="1">
+    <w:tmpl w:val="C3400814"/>
+    <w:lvl w:ilvl="0" w:tplc="6AC6B3EA">
       <w:start w:val="1"/>
       <w:numFmt w:val="bullet"/>
-      <w:lvlText w:val="●"/>
+      <w:lvlText w:val="•"/>
       <w:lvlJc w:val="left"/>
       <w:pPr>
-        <w:ind w:left="720" w:hanging="360"/>
+        <w:ind w:left="567" w:hanging="283"/>
       </w:pPr>
     </w:lvl>
-    <w:lvl w:ilvl="1" w:tplc="FE28EA68" w:tentative="1">
-      <w:start w:val="1"/>
-      <w:numFmt w:val="bullet"/>
-      <w:lvlText w:val="○"/>
+    <w:lvl w:ilvl="1" w:tplc="89E2367E">
+      <w:numFmt w:val="decimal"/>
+      <w:lvlText w:val=""/>
       <w:lvlJc w:val="left"/>
-      <w:pPr>
-        <w:ind w:left="1440" w:hanging="360"/>
-      </w:pPr>
     </w:lvl>
-    <w:lvl w:ilvl="2" w:tplc="5792FB12" w:tentative="1">
-      <w:start w:val="1"/>
-      <w:numFmt w:val="bullet"/>
-      <w:lvlText w:val="■"/>
+    <w:lvl w:ilvl="2" w:tplc="F32C6B4C">
+      <w:numFmt w:val="decimal"/>
+      <w:lvlText w:val=""/>
       <w:lvlJc w:val="left"/>
-      <w:pPr>
-        <w:ind w:left="2160" w:hanging="360"/>
-      </w:pPr>
     </w:lvl>
-    <w:lvl w:ilvl="3" w:tplc="A0440352" w:tentative="1">
-      <w:start w:val="1"/>
-      <w:numFmt w:val="bullet"/>
-      <w:lvlText w:val="●"/>
+    <w:lvl w:ilvl="3" w:tplc="D01AFB3E">
+      <w:numFmt w:val="decimal"/>
+      <w:lvlText w:val=""/>
       <w:lvlJc w:val="left"/>
-      <w:pPr>
-        <w:ind w:left="2880" w:hanging="360"/>
-      </w:pPr>
     </w:lvl>
-    <w:lvl w:ilvl="4" w:tplc="BBC4C70A" w:tentative="1">
-      <w:start w:val="1"/>
-      <w:numFmt w:val="bullet"/>
-      <w:lvlText w:val="○"/>
+    <w:lvl w:ilvl="4" w:tplc="02F85290">
+      <w:numFmt w:val="decimal"/>
+      <w:lvlText w:val=""/>
       <w:lvlJc w:val="left"/>
-      <w:pPr>
-        <w:ind w:left="3600" w:hanging="360"/>
-      </w:pPr>
     </w:lvl>
-    <w:lvl w:ilvl="5" w:tplc="506A81D6" w:tentative="1">
-      <w:start w:val="1"/>
-      <w:numFmt w:val="bullet"/>
-      <w:lvlText w:val="■"/>
+    <w:lvl w:ilvl="5" w:tplc="B52CF452">
+      <w:numFmt w:val="decimal"/>
+      <w:lvlText w:val=""/>
       <w:lvlJc w:val="left"/>
-      <w:pPr>
-        <w:ind w:left="4320" w:hanging="360"/>
-      </w:pPr>
     </w:lvl>
-    <w:lvl w:ilvl="6" w:tplc="927E8F7A" w:tentative="1">
-      <w:start w:val="1"/>
-      <w:numFmt w:val="bullet"/>
-      <w:lvlText w:val="●"/>
+    <w:lvl w:ilvl="6" w:tplc="8FD451DA">
+      <w:numFmt w:val="decimal"/>
+      <w:lvlText w:val=""/>
       <w:lvlJc w:val="left"/>
-      <w:pPr>
-        <w:ind w:left="5040" w:hanging="360"/>
-      </w:pPr>
     </w:lvl>
-    <w:lvl w:ilvl="7" w:tplc="AF06F18A" w:tentative="1">
-      <w:start w:val="1"/>
-      <w:numFmt w:val="bullet"/>
-      <w:lvlText w:val="●"/>
+    <w:lvl w:ilvl="7" w:tplc="6C70A48A">
+      <w:numFmt w:val="decimal"/>
+      <w:lvlText w:val=""/>
       <w:lvlJc w:val="left"/>
-      <w:pPr>
-        <w:ind w:left="5760" w:hanging="360"/>
-      </w:pPr>
     </w:lvl>
-    <w:lvl w:ilvl="8" w:tplc="DC926F12" w:tentative="1">
-      <w:start w:val="1"/>
-      <w:numFmt w:val="bullet"/>
-      <w:lvlText w:val="●"/>
+    <w:lvl w:ilvl="8" w:tplc="E8EC3C22">
+      <w:numFmt w:val="decimal"/>
+      <w:lvlText w:val=""/>
       <w:lvlJc w:val="left"/>
-      <w:pPr>
-        <w:ind w:left="6480" w:hanging="360"/>
-      </w:pPr>
     </w:lvl>
   </w:abstractNum>
-  <w:num w:numId="1" w16cid:durableId="1734498342">
-    <w:abstractNumId w:val="2"/>
-    <w:lvlOverride w:ilvl="0">
-      <w:startOverride w:val="1"/>
-    </w:lvlOverride>
-  </w:num>
-  <w:num w:numId="2" w16cid:durableId="833110831">
+  <w:num w:numId="1" w16cid:durableId="70809404">
     <w:abstractNumId w:val="0"/>
     <w:lvlOverride w:ilvl="0">
       <w:startOverride w:val="1"/>
     </w:lvlOverride>
   </w:num>
-  <w:num w:numId="3" w16cid:durableId="1731075529">
+  <w:num w:numId="2" w16cid:durableId="19356281">
     <w:abstractNumId w:val="1"/>
+    <w:lvlOverride w:ilvl="0">
+      <w:startOverride w:val="1"/>
+    </w:lvlOverride>
+  </w:num>
+  <w:num w:numId="3" w16cid:durableId="682320332">
+    <w:abstractNumId w:val="2"/>
     <w:lvlOverride w:ilvl="0">
       <w:startOverride w:val="1"/>
     </w:lvlOverride>

</xml_diff>